<commit_message>
Add Word report generation
- created template for Word report
- added text_library for static and dynamic report text
- implemented report_generator (styles + formatting)
- implemented score_calculations for assessment scoring
- added report_helper to prepare user_data structure
- added test_report_generator with dummy data (creates test_report)
- updated phases to standardize answer structure for report generation
- results_report.docx generates to results folder

To add : unique names for all reports
</commit_message>
<xml_diff>
--- a/results/results_report.docx
+++ b/results/results_report.docx
@@ -60,7 +60,7 @@
         <w:rPr>
           <w:b/>
         </w:rPr>
-        <w:t>Extraversie | 0/30</w:t>
+        <w:t>Extraversie | 17/30</w:t>
       </w:r>
     </w:p>
     <w:p>
@@ -69,7 +69,7 @@
         <w:ind w:left="0"/>
       </w:pPr>
       <w:r>
-        <w:t>Lage score op extraversie</w:t>
+        <w:t>Neutrale score op extraversie</w:t>
       </w:r>
     </w:p>
     <w:p>
@@ -78,96 +78,7 @@
         <w:ind w:left="0"/>
       </w:pPr>
       <w:r>
-        <w:t>Als je laag scoort op extraversie heb je een voorkeur voor rust en kleine sociale omgevingen. Je voelt je vaak prettiger met jezelf of met een kleine groep vertrouwde mensen.</w:t>
-      </w:r>
-    </w:p>
-    <w:p>
-      <w:pPr>
-        <w:spacing w:after="120"/>
-        <w:ind w:left="0"/>
-      </w:pPr>
-      <w:r>
-        <w:t>Dit zie je terug in:</w:t>
-      </w:r>
-    </w:p>
-    <w:p>
-      <w:pPr>
-        <w:spacing w:after="120"/>
-        <w:ind w:left="567"/>
-      </w:pPr>
-      <w:r>
-        <w:t>• Hartelijkheid: Je bent gereserveerd en maakt niet snel contact met onbekenden.</w:t>
-      </w:r>
-    </w:p>
-    <w:p>
-      <w:pPr>
-        <w:spacing w:after="120"/>
-        <w:ind w:left="567"/>
-      </w:pPr>
-      <w:r>
-        <w:t>• Sociabiliteit: Je vermijdt grote groepen en voelt je prettiger in kleine kringen.</w:t>
-      </w:r>
-    </w:p>
-    <w:p>
-      <w:pPr>
-        <w:spacing w:after="120"/>
-        <w:ind w:left="567"/>
-      </w:pPr>
-      <w:r>
-        <w:t>• Dominantie: Je blijft liever op de achtergrond en neemt zelden de leiding.</w:t>
-      </w:r>
-    </w:p>
-    <w:p>
-      <w:pPr>
-        <w:spacing w:after="120"/>
-        <w:ind w:left="567"/>
-      </w:pPr>
-      <w:r>
-        <w:t>• Energie: Je hebt een kalme, bedachtzame energie.</w:t>
-      </w:r>
-    </w:p>
-    <w:p>
-      <w:pPr>
-        <w:spacing w:after="120"/>
-        <w:ind w:left="567"/>
-      </w:pPr>
-      <w:r>
-        <w:t>• Avonturisme: Je zoekt geen risico’s en houdt van voorspelbaarheid.</w:t>
-      </w:r>
-    </w:p>
-    <w:p>
-      <w:pPr>
-        <w:spacing w:after="120"/>
-        <w:ind w:left="567"/>
-      </w:pPr>
-      <w:r>
-        <w:t>• Vrolijkheid: Je hebt een rustige en ingetogen blijdschap.</w:t>
-      </w:r>
-    </w:p>
-    <w:p>
-      <w:r>
-        <w:rPr>
-          <w:b/>
-        </w:rPr>
-        <w:t>Altruïsme | 28/30</w:t>
-      </w:r>
-    </w:p>
-    <w:p>
-      <w:pPr>
-        <w:spacing w:after="120"/>
-        <w:ind w:left="0"/>
-      </w:pPr>
-      <w:r>
-        <w:t>Hoge score op altruïsme</w:t>
-      </w:r>
-    </w:p>
-    <w:p>
-      <w:pPr>
-        <w:spacing w:after="120"/>
-        <w:ind w:left="0"/>
-      </w:pPr>
-      <w:r>
-        <w:t>Als je hoog scoort op altruïsme, stel je het belang van anderen vaak boven je eigen belang. Je beleeft relaties vooral vanuit het perspectief van de ander en kunt je gemakkelijk in hen verplaatsen. Dit maakt je hulpvaardig, vriendelijk en gericht op samenwerking. Je bent van nature begaan met het welzijn van anderen en hebt een milde, begripvolle houding.</w:t>
+        <w:t>Met een gemiddelde score op extraversie laat je een gebalanceerde aanpak zien in sociale situaties. Je kunt genieten van gezelschap, maar hebt ook momenten nodig om alleen te zijn.</w:t>
       </w:r>
     </w:p>
     <w:p>
@@ -185,7 +96,7 @@
         <w:ind w:left="567"/>
       </w:pPr>
       <w:r>
-        <w:t>• Vertrouwen: Je gelooft in de goede intenties van anderen.</w:t>
+        <w:t>• Hartelijkheid: Je bent vriendelijk, maar niet altijd degene die het initiatief neemt in sociale interacties.</w:t>
       </w:r>
     </w:p>
     <w:p>
@@ -194,7 +105,7 @@
         <w:ind w:left="567"/>
       </w:pPr>
       <w:r>
-        <w:t>• Oprechtheid: Je bent eerlijk en oprecht in je interacties.</w:t>
+        <w:t>• Sociabiliteit: Je voelt je prettig in groepen, maar hebt geen behoefte om altijd het middelpunt van de aandacht te zijn.</w:t>
       </w:r>
     </w:p>
     <w:p>
@@ -203,7 +114,7 @@
         <w:ind w:left="567"/>
       </w:pPr>
       <w:r>
-        <w:t>• Zorgzaamheid: Je staat klaar om anderen te helpen wanneer ze je nodig hebben.</w:t>
+        <w:t>• Dominantie: Je neemt leiding als het nodig is, maar kunt ook volgen.</w:t>
       </w:r>
     </w:p>
     <w:p>
@@ -212,7 +123,7 @@
         <w:ind w:left="567"/>
       </w:pPr>
       <w:r>
-        <w:t>• Inschikkelijkheid: Je bent flexibel en staat open voor compromissen.</w:t>
+        <w:t>• Energie: Je hebt een stabiel energieniveau zonder opvallend uitbundig te zijn.</w:t>
       </w:r>
     </w:p>
     <w:p>
@@ -221,7 +132,7 @@
         <w:ind w:left="567"/>
       </w:pPr>
       <w:r>
-        <w:t>• Bescheidenheid: Je laat je prestaties en successen voor zichzelf spreken.</w:t>
+        <w:t>• Avonturisme: Je probeert af en toe iets nieuws maar zoekt niet constant avontuur.</w:t>
       </w:r>
     </w:p>
     <w:p>
@@ -230,7 +141,7 @@
         <w:ind w:left="567"/>
       </w:pPr>
       <w:r>
-        <w:t>• Medeleven: Je voelt je oprecht betrokken bij de emoties en uitdagingen van anderen.</w:t>
+        <w:t>• Vrolijkheid: Je hebt een evenwichtige uitstraling en bent positief zonder overdadig uitbundig te zijn.</w:t>
       </w:r>
     </w:p>
     <w:p>
@@ -238,7 +149,7 @@
         <w:rPr>
           <w:b/>
         </w:rPr>
-        <w:t>Consciëntieusheid | 20/30</w:t>
+        <w:t>Altruïsme | 19/30</w:t>
       </w:r>
     </w:p>
     <w:p>
@@ -247,7 +158,7 @@
         <w:ind w:left="0"/>
       </w:pPr>
       <w:r>
-        <w:t>Hoge score op consciëntieusheid</w:t>
+        <w:t>Neutrale score op altruïsme</w:t>
       </w:r>
     </w:p>
     <w:p>
@@ -256,7 +167,7 @@
         <w:ind w:left="0"/>
       </w:pPr>
       <w:r>
-        <w:t>Als je hoog scoort op consciëntieusheid, ben je georganiseerd, doelgericht en verantwoordelijk. Je houdt ervan om dingen goed te plannen en je volgt altijd de regels. Je hebt een sterk verantwoordelijkheidsgevoel en houdt ervan om je taken goed uit te voeren. Dit zie je terug in de volgende eigenschappen:</w:t>
+        <w:t>Met een gemiddelde score op altruïsme houd je een balans tussen je eigen belangen en die van anderen. Je bent bereid om te helpen en samen te werken, maar je bewaakt ook je eigen grenzen. Je kunt empathisch zijn zonder jezelf weg te cijferen. Dit zie je terug in:</w:t>
       </w:r>
     </w:p>
     <w:p>
@@ -265,7 +176,7 @@
         <w:ind w:left="567"/>
       </w:pPr>
       <w:r>
-        <w:t>• Doelmatigheid: Je hebt duidelijke doelen voor ogen en werkt hard om deze te bereiken. Je houdt je goed aan deadlines en laat je niet snel afleiden.</w:t>
+        <w:t>• Vertrouwen: Je gelooft in anderen, maar blijft alert op intenties.</w:t>
       </w:r>
     </w:p>
     <w:p>
@@ -274,7 +185,7 @@
         <w:ind w:left="567"/>
       </w:pPr>
       <w:r>
-        <w:t>• Orderlijkheid: Je hebt altijd een georganiseerde werkplek, waar alles op de juiste plaats ligt. Je hebt een systematische benadering van alles wat je doet.</w:t>
+        <w:t>• Oprechtheid: Je bent meestal eerlijk, maar maakt soms strategische keuzes.</w:t>
       </w:r>
     </w:p>
     <w:p>
@@ -283,7 +194,7 @@
         <w:ind w:left="567"/>
       </w:pPr>
       <w:r>
-        <w:t>• Betrouwbaarheid: Je kunt altijd op je woord vertrouwen. Als je een belofte doet, zorg je ervoor dat je deze nakomt, zelfs als het betekent dat je extra moeite moet doen.</w:t>
+        <w:t>• Zorgzaamheid: Je helpt anderen als het nodig is, maar niet ten koste van jezelf.</w:t>
       </w:r>
     </w:p>
     <w:p>
@@ -292,7 +203,7 @@
         <w:ind w:left="567"/>
       </w:pPr>
       <w:r>
-        <w:t>• Ambitie: Je hebt hoge verwachtingen van jezelf en streeft naar succes in je carrière. Je bent gemotiveerd om verder te groeien en neemt de nodige stappen om je doelen te behalen.</w:t>
+        <w:t>• Inschikkelijkheid: Je kunt compromissen sluiten, maar ook op je standpunt blijven staan.</w:t>
       </w:r>
     </w:p>
     <w:p>
@@ -301,7 +212,7 @@
         <w:ind w:left="567"/>
       </w:pPr>
       <w:r>
-        <w:t>• Zelfdiscipline: Je hebt de capaciteit om jezelf te reguleren. Je vermijdt afleidingen en blijft gefocust, ook wanneer het moeilijk wordt.</w:t>
+        <w:t>• Bescheidenheid: Je erkent je successen zonder ze te benadrukken.</w:t>
       </w:r>
     </w:p>
     <w:p>
@@ -310,7 +221,7 @@
         <w:ind w:left="567"/>
       </w:pPr>
       <w:r>
-        <w:t>• Bedachtzaamheid: Je neemt de tijd om beslissingen zorgvuldig te overwegen. Je reageert niet impulsief, maar denkt na over de langetermijngevolgen van je acties.</w:t>
+        <w:t>• Medeleven: Je bent betrokken, maar laat je niet overspoelen door de emoties van anderen.</w:t>
       </w:r>
     </w:p>
     <w:p>
@@ -318,7 +229,87 @@
         <w:rPr>
           <w:b/>
         </w:rPr>
-        <w:t>Neuroticisme | 16/30</w:t>
+        <w:t>Consciëntieusheid | 19/30</w:t>
+      </w:r>
+    </w:p>
+    <w:p>
+      <w:pPr>
+        <w:spacing w:after="120"/>
+        <w:ind w:left="0"/>
+      </w:pPr>
+      <w:r>
+        <w:t>Neutrale score op consciëntieusheid</w:t>
+      </w:r>
+    </w:p>
+    <w:p>
+      <w:pPr>
+        <w:spacing w:after="120"/>
+        <w:ind w:left="0"/>
+      </w:pPr>
+      <w:r>
+        <w:t>Als je neutraal scoort op consciëntieusheid, ben je redelijk georganiseerd en verantwoordelijk, maar je hebt niet altijd een rigide structuur in je leven. Je voldoet aan je verplichtingen, maar je hoeft niet per se alles tot in de puntjes te plannen. Je hebt een gezonde balans tussen werk en ontspanning. Dit zie je terug in de volgende eigenschappen:</w:t>
+      </w:r>
+    </w:p>
+    <w:p>
+      <w:pPr>
+        <w:spacing w:after="120"/>
+        <w:ind w:left="567"/>
+      </w:pPr>
+      <w:r>
+        <w:t>• Doelmatigheid: Je hebt doelen, maar je werkt niet altijd op een gestructureerde manier om ze te bereiken. Soms ben je wat flexibeler in je benadering.</w:t>
+      </w:r>
+    </w:p>
+    <w:p>
+      <w:pPr>
+        <w:spacing w:after="120"/>
+        <w:ind w:left="567"/>
+      </w:pPr>
+      <w:r>
+        <w:t>• Orderlijkheid: Je werkplek is redelijk georganiseerd, maar af en toe laat je dingen liggen of raakt je bureau een beetje rommelig. Je hebt geen grote moeite met het vinden van een balans tussen orde en chaos.</w:t>
+      </w:r>
+    </w:p>
+    <w:p>
+      <w:pPr>
+        <w:spacing w:after="120"/>
+        <w:ind w:left="567"/>
+      </w:pPr>
+      <w:r>
+        <w:t>• Betrouwbaarheid: Je komt meestal je verplichtingen na, maar je hebt af en toe wat meer tijd nodig om dingen af te maken. Je bent betrouwbaar, maar niet altijd strikt.</w:t>
+      </w:r>
+    </w:p>
+    <w:p>
+      <w:pPr>
+        <w:spacing w:after="120"/>
+        <w:ind w:left="567"/>
+      </w:pPr>
+      <w:r>
+        <w:t>• Ambitie: Je hebt een gezonde ambitie, maar je bent niet geobsedeerd door succes. Je bent tevreden met je werk, zolang het interessant blijft, maar je zoekt niet per se naar manieren om snel op te klimmen.</w:t>
+      </w:r>
+    </w:p>
+    <w:p>
+      <w:pPr>
+        <w:spacing w:after="120"/>
+        <w:ind w:left="567"/>
+      </w:pPr>
+      <w:r>
+        <w:t>• Zelfdiscipline: Je hebt zelfdiscipline, maar je laat je af en toe afleiden. Soms stel je dingen uit, maar over het algemeen werk je voldoende om je doelen te behalen.</w:t>
+      </w:r>
+    </w:p>
+    <w:p>
+      <w:pPr>
+        <w:spacing w:after="120"/>
+        <w:ind w:left="567"/>
+      </w:pPr>
+      <w:r>
+        <w:t>• Bedachtzaamheid: Je denkt na over je beslissingen, maar soms reageer je snel op situaties zonder alles in detail te overwegen.</w:t>
+      </w:r>
+    </w:p>
+    <w:p>
+      <w:r>
+        <w:rPr>
+          <w:b/>
+        </w:rPr>
+        <w:t>Neuroticisme | 17/30</w:t>
       </w:r>
     </w:p>
     <w:p>
@@ -398,7 +389,7 @@
         <w:rPr>
           <w:b/>
         </w:rPr>
-        <w:t>Openheid | 32/30</w:t>
+        <w:t>Openheid | 20/30</w:t>
       </w:r>
     </w:p>
     <w:p>
@@ -505,12 +496,12 @@
         <w:rPr>
           <w:b/>
         </w:rPr>
-        <w:t xml:space="preserve">Omhoog komen | </w:t>
+        <w:t xml:space="preserve">Balans vinden | </w:t>
       </w:r>
     </w:p>
     <w:p>
       <w:r>
-        <w:t>De loopbaanoriëntatie "Omhoog komen" is gericht op jouw streven naar vooruitgang binnen een organisatie, waarbij het beklimmen van de hiërarchische ladder en het verkrijgen van meer status en invloed centraal staan. Dit proces gaat gepaard met toenemende verantwoordelijkheden, uitdagingen en kansen om leiderschap te tonen. Prestige en beloning groeien naarmate je hogere posities bereikt, wat jou motivatie biedt om continue professionele ontwikkeling na te streven en strategisch te netwerken binnen de organisatie.</w:t>
+        <w:t>De loopbaanoriëntatie "Balans vinden" richt zich op jouw streven naar een optimaal evenwicht tussen werk, privé-leven en zelfontwikkeling. Voor jou is werk slechts een deel van je totale levensvervulling. Je hecht veel waarde aan de kwaliteit van leven en zoekt naar manieren om werk en persoonlijk leven in harmonie te brengen. De balans tussen werk en privé kan variëren afhankelijk van de situatie, maar het streven naar een gezonde levensstijl en persoonlijke groei staat centraal in je loopbaanbeslissingen.</w:t>
       </w:r>
     </w:p>
     <w:p>
@@ -627,7 +618,7 @@
         <w:rPr>
           <w:b/>
         </w:rPr>
-        <w:t xml:space="preserve">Marketing, sales en service | </w:t>
+        <w:t xml:space="preserve">Transport, distributie en logistiek | </w:t>
       </w:r>
     </w:p>
     <w:p>
@@ -636,7 +627,7 @@
         <w:ind w:left="0"/>
       </w:pPr>
       <w:r>
-        <w:t>Marketing, sales en service omvatten alle activiteiten die gericht zijn op het promoten, verkopen en ondersteunen van producten en diensten.</w:t>
+        <w:t>Transport, distributie en logistiek omvat:</w:t>
       </w:r>
     </w:p>
     <w:p>
@@ -645,7 +636,7 @@
         <w:ind w:left="567"/>
       </w:pPr>
       <w:r>
-        <w:t>• Marketing: Het proces van het identificeren van klantbehoeften en het creëren van waardevolle aanbiedingen, met behulp van strategieën zoals reclame, public relations en digitale marketing om merkbekendheid en klantbetrokkenheid te vergroten.</w:t>
+        <w:t>• Planning, beheer en uitvoering van het verplaatsen van mensen, materialen en goederen over de weg, via pijpleidingen, luchtvaart, spoorwegen en waterwegen.</w:t>
       </w:r>
     </w:p>
     <w:p>
@@ -654,7 +645,7 @@
         <w:ind w:left="567"/>
       </w:pPr>
       <w:r>
-        <w:t>• Sales: Het directe verkoopproces waarbij producten of diensten aan klanten worden aangeboden, inclusief het opbouwen van klantrelaties, onderhandelen en sluiten van deals om omzet te genereren.</w:t>
+        <w:t>• Transportinfrastructuur: Ontwikkeling en onderhoud van infrastructuur zoals wegen, bruggen, havens en luchthavens.</w:t>
       </w:r>
     </w:p>
     <w:p>
@@ -663,7 +654,25 @@
         <w:ind w:left="567"/>
       </w:pPr>
       <w:r>
-        <w:t>• Service: Het bieden van ondersteuning en diensten na de verkoop om klanttevredenheid te waarborgen, zoals klantenservice, technische ondersteuning en onderhoudsdiensten.</w:t>
+        <w:t>• Logistieke diensten: Beheer van voorraad, opslag en distributie van goederen.</w:t>
+      </w:r>
+    </w:p>
+    <w:p>
+      <w:pPr>
+        <w:spacing w:after="120"/>
+        <w:ind w:left="567"/>
+      </w:pPr>
+      <w:r>
+        <w:t>• Planning en beheer: Coördinatie van transportroutes, schema's en logistieke processen.</w:t>
+      </w:r>
+    </w:p>
+    <w:p>
+      <w:pPr>
+        <w:spacing w:after="120"/>
+        <w:ind w:left="567"/>
+      </w:pPr>
+      <w:r>
+        <w:t>• Technische ondersteuningsdiensten: Onderhoud van voertuigen, apparatuur en faciliteiten om een efficiënte werking te garanderen.</w:t>
       </w:r>
     </w:p>
     <w:p>
@@ -672,7 +681,7 @@
         <w:ind w:left="0"/>
       </w:pPr>
       <w:r>
-        <w:t>Samen zorgen deze drie elementen ervoor dat bedrijven hun producten effectief op de markt brengen, verkopen en langdurige klantrelaties onderhouden.</w:t>
+        <w:t>Deze sector speelt een essentiële rol in het faciliteren van handel, transport en mobiliteit en draagt bij aan economische groei door het optimaliseren van transport- en logistieke oplossingen wereldwijd.</w:t>
       </w:r>
     </w:p>
     <w:p>
@@ -961,7 +970,10 @@
     </w:p>
     <w:p>
       <w:r>
-        <w:t>Lorem ipsum dolor sit amet, consectetur adipiscing elit. Aenean augue enim, placerat vel odio in, mollis mattis urna. Orci varius natoque penatibus et magnis dis parturient montes, nascetur ridiculus mus. Morbi hendrerit neque lobortis placerat pellentesque. Morbi leo nunc, accumsan placerat dignissim sit amet, vestibulum vitae nisl. Sed sed diam dictum, viverra ante non, dignissim sapien. Orci varius natoque penatibus et magnis dis parturient montes, nascetur ridiculus mus. Sed id nunc eleifend, gravida nisi volutpat, mollis dui. Integer interdum sapien vitae velit imperdiet, eget feugiat urna tristique. Aliquam ullamcorper, magna non varius rutrum, eros eros sollicitudin nulla, id semper nulla neque eu nisi. Ut ac dui pretium mi egestas posuere. Sed blandit, nisi eget laoreet sodales, nibh ante vulputate lectus, quis rhoncus mi massa et massa. Ut euismod lorem libero. Quisque nec consectetur massa, eu dictum ligula. Proin in leo leo. Orci varius natoque penatibus et magnis dis parturient montes, nascetur ridiculus mus.</w:t>
+        <w:t>Integer orci massa, vestibulum ac leo at, suscipit accumsan purus. Vestibulum commodo neque sit amet leo efficitur, vitae tempor velit volutpat. Etiam est magna, porttitor eget tellus nec, rutrum bibendum metus. Pellentesque habitant morbi tristique senectus et netus et malesuada fames ac turpis egestas. In hendrerit sapien et aliquet vehicula. Phasellus eleifend, libero vel egestas sodales, lorem nisi aliquam dui, at eleifend mauris massa non est. Nunc sed placerat nisl. Nullam ac purus ut sem pretium efficitur.</w:t>
+        <w:br/>
+        <w:br/>
+        <w:t>Donec elementum enim nisl, vitae mattis diam iaculis ut. In hac habitasse platea dictumst. Cras hendrerit in odio vitae pretium. Praesent aliquet scelerisque orci, at laoreet neque rutrum sed. Maecenas augue turpis, sodales ac efficitur interdum, scelerisque id felis. Donec tincidunt, magna eu ultricies convallis, est ante rutrum enim, dictum varius felis mi porta neque. Donec fermentum laoreet turpis, at hendrerit nulla vestibulum vitae. Praesent vulputate ex a tempor iaculis.</w:t>
       </w:r>
     </w:p>
     <w:p>
@@ -974,7 +986,10 @@
     </w:p>
     <w:p>
       <w:r>
-        <w:t>Lorem ipsum dolor sit amet, consectetur adipiscing elit. Aenean augue enim, placerat vel odio in, mollis mattis urna. Orci varius natoque penatibus et magnis dis parturient montes, nascetur ridiculus mus. Morbi hendrerit neque lobortis placerat pellentesque. Morbi leo nunc, accumsan placerat dignissim sit amet, vestibulum vitae nisl. Sed sed diam dictum, viverra ante non, dignissim sapien. Orci varius natoque penatibus et magnis dis parturient montes, nascetur ridiculus mus. Sed id nunc eleifend, gravida nisi volutpat, mollis dui. Integer interdum sapien vitae velit imperdiet, eget feugiat urna tristique. Aliquam ullamcorper, magna non varius rutrum, eros eros sollicitudin nulla, id semper nulla neque eu nisi. Ut ac dui pretium mi egestas posuere. Sed blandit, nisi eget laoreet sodales, nibh ante vulputate lectus, quis rhoncus mi massa et massa.</w:t>
+        <w:t>Integer orci massa, vestibulum ac leo at, suscipit accumsan purus. Vestibulum commodo neque sit amet leo efficitur, vitae tempor velit volutpat. Etiam est magna, porttitor eget tellus nec, rutrum bibendum metus. Pellentesque habitant morbi tristique senectus et netus et malesuada fames ac turpis egestas. In hendrerit sapien et aliquet vehicula. Phasellus eleifend, libero vel egestas sodales, lorem nisi aliquam dui, at eleifend mauris massa non est. Nunc sed placerat nisl. Nullam ac purus ut sem pretium efficitur.</w:t>
+        <w:br/>
+        <w:br/>
+        <w:t>Donec elementum enim nisl, vitae mattis diam iaculis ut. In hac habitasse platea dictumst. Cras hendrerit in odio vitae pretium. Praesent aliquet scelerisque orci, at laoreet neque rutrum sed. Maecenas augue turpis, sodales ac efficitur interdum, scelerisque id felis. Donec tincidunt, magna eu ultricies convallis, est ante rutrum enim, dictum varius felis mi porta neque.</w:t>
       </w:r>
     </w:p>
     <w:p>
@@ -987,7 +1002,13 @@
     </w:p>
     <w:p>
       <w:r>
-        <w:t>Lorem ipsum dolor sit amet, consectetur adipiscing elit. Aenean augue enim, placerat vel odio in, mollis mattis urna. Orci varius natoque penatibus et magnis dis parturient montes, nascetur ridiculus mus. Morbi hendrerit neque lobortis placerat pellentesque. Morbi leo nunc, accumsan placerat dignissim sit amet, vestibulum vitae nisl. Sed sed diam dictum, viverra ante non, dignissim sapien. Orci varius natoque penatibus et magnis dis parturient montes, nascetur ridiculus mus. Sed id nunc eleifend, gravida nisi volutpat, mollis dui. Integer interdum sapien vitae velit imperdiet, eget feugiat urna tristique. Aliquam ullamcorper, magna non varius rutrum, eros eros sollicitudin nulla, id semper nulla neque eu nisi.</w:t>
+        <w:t>Integer orci massa, vestibulum ac leo at, suscipit accumsan purus. Vestibulum commodo neque sit amet leo efficitur, vitae tempor velit volutpat. Etiam est magna, porttitor eget tellus nec, rutrum bibendum metus. Pellentesque habitant morbi tristique senectus et netus et malesuada fames ac turpis egestas. In hendrerit sapien et aliquet vehicula. Phasellus eleifend, libero vel egestas sodales, lorem nisi aliquam dui, at eleifend mauris massa non est. Nunc sed placerat nisl. Nullam ac purus ut sem pretium efficitur.</w:t>
+        <w:br/>
+        <w:br/>
+        <w:t>Donec elementum enim nisl, vitae mattis diam iaculis ut. In hac habitasse platea dictumst.Integer orci massa, vestibulum ac leo at, suscipit accumsan purus. Vestibulum commodo neque sit amet leo efficitur, vitae tempor velit volutpat. Etiam est magna, porttitor eget tellus nec, rutrum bibendum metus. Pellentesque habitant morbi tristique senectus et netus et malesuada fames ac turpis egestas. In hendrerit sapien et aliquet vehicula. Phasellus eleifend, libero vel egestas sodales, lorem nisi aliquam dui, at eleifend mauris massa non est. Nunc sed placerat nisl. Nullam ac purus ut sem pretium efficitur.</w:t>
+        <w:br/>
+        <w:br/>
+        <w:t>Donec elementum enim nisl, vitae mattis diam iaculis ut. In hac habitasse platea dictumst. Cras hendrerit in odio vitae pretium. Praesent aliquet scelerisque orci, at laoreet neque rutrum sed. Maecenas augue turpis, sodales ac efficitur interdum, scelerisque id felis. Donec tincidunt, magna eu ultricies convallis, est ante rutrum enim, dictum varius felis mi porta neque. Donec fermentum laoreet turpis, at hendrerit nulla vestibulum vitae. Praesent vulputate ex a tempor iaculis.</w:t>
       </w:r>
     </w:p>
     <w:p>
@@ -1000,7 +1021,10 @@
     </w:p>
     <w:p>
       <w:r>
-        <w:t>Lorem ipsum dolor sit amet, consectetur adipiscing elit. Aenean augue enim, placerat vel odio in, mollis mattis urna. Orci varius natoque penatibus et magnis dis parturient montes, nascetur ridiculus mus. Morbi hendrerit neque lobortis placerat pellentesque. Morbi leo nunc, accumsan placerat dignissim sit amet, vestibulum vitae nisl. Sed sed diam dictum, viverra ante non, dignissim sapien. Orci varius natoque penatibus et magnis dis parturient montes, nascetur ridiculus mus. Sed id nunc eleifend, gravida nisi volutpat, mollis dui.</w:t>
+        <w:t>Integer orci massa, vestibulum ac leo at, suscipit accumsan purus. Vestibulum commodo neque sit amet leo efficitur, vitae tempor velit volutpat. Etiam est magna, porttitor eget tellus nec, rutrum bibendum metus. Pellentesque habitant morbi tristique senectus et netus et malesuada fames ac turpis egestas. In hendrerit sapien et aliquet vehicula. Phasellus eleifend, libero vel egestas sodales, lorem nisi aliquam dui, at eleifend mauris massa non est. Nunc sed placerat nisl. Nullam ac purus ut sem pretium efficitur.</w:t>
+        <w:br/>
+        <w:br/>
+        <w:t>Donec elementum enim nisl, vitae mattis diam iaculis ut. In hac habitasse platea dictumst. Cras hendrerit in odio vitae pretium. Praesent aliquet scelerisque orci, at laoreet neque rutrum sed. Maecenas augue turpis, sodales ac efficitur interdum, scelerisque id felis. Donec tincidunt, magna eu ultricies convallis, est ante rutrum enim, dictum varius felis mi porta neque. Donec fermentum laoreet turpis, at hendrerit nulla vestibulum vitae.</w:t>
       </w:r>
     </w:p>
     <w:p>
@@ -1013,7 +1037,7 @@
     </w:p>
     <w:p>
       <w:r>
-        <w:t>Lorem ipsum dolor sit amet, consectetur adipiscing elit. Aenean augue enim, placerat vel odio in, mollis mattis urna. Orci varius natoque penatibus et magnis dis parturient montes, nascetur ridiculus mus. Morbi hendrerit neque lobortis placerat pellentesque. Morbi leo.</w:t>
+        <w:t>Integer orci massa, vestibulum ac leo at, suscipit accumsan purus. Vestibulum commodo neque sit amet leo efficitur, vitae tempor velit volutpat. Etiam est magna, porttitor eget tellus nec, rutrum bibendum metus. Pellentesque habitant morbi tristique senectus et netus et malesuada fames ac turpis egestas. In hendrerit sapien et aliquet vehicula. Phasellus eleifend, libero vel egestas sodales, lorem nisi aliquam dui, at eleifend mauris massa non est. Nunc sed placerat nisl.</w:t>
       </w:r>
     </w:p>
     <w:sectPr>

</xml_diff>

<commit_message>
WIP: Client page added
</commit_message>
<xml_diff>
--- a/results/results_report.docx
+++ b/results/results_report.docx
@@ -60,7 +60,7 @@
         <w:rPr>
           <w:b/>
         </w:rPr>
-        <w:t>Extraversie | 17/30</w:t>
+        <w:t>Extraversie | 20/30</w:t>
       </w:r>
     </w:p>
     <w:p>
@@ -69,7 +69,7 @@
         <w:ind w:left="0"/>
       </w:pPr>
       <w:r>
-        <w:t>Neutrale score op extraversie</w:t>
+        <w:t>Hoge score op extraversie</w:t>
       </w:r>
     </w:p>
     <w:p>
@@ -78,7 +78,7 @@
         <w:ind w:left="0"/>
       </w:pPr>
       <w:r>
-        <w:t>Met een gemiddelde score op extraversie laat je een gebalanceerde aanpak zien in sociale situaties. Je kunt genieten van gezelschap, maar hebt ook momenten nodig om alleen te zijn.</w:t>
+        <w:t>Als je hoog scoort op extraversie, straal je energie en enthousiasme uit in sociale omgevingen. Je zoekt graag gezelschap op, geniet van groepsactiviteiten en neemt vaak een leidende rol. Je hebt een voorkeur voor actieve en uitdagende situaties, bent assertief en houdt van nieuwe ervaringen.</w:t>
       </w:r>
     </w:p>
     <w:p>
@@ -87,7 +87,7 @@
         <w:ind w:left="0"/>
       </w:pPr>
       <w:r>
-        <w:t>Dit komt tot uiting in:</w:t>
+        <w:t>Dit zie je terug in de volgende eigenschappen:</w:t>
       </w:r>
     </w:p>
     <w:p>
@@ -96,7 +96,7 @@
         <w:ind w:left="567"/>
       </w:pPr>
       <w:r>
-        <w:t>• Hartelijkheid: Je bent vriendelijk, maar niet altijd degene die het initiatief neemt in sociale interacties.</w:t>
+        <w:t>• Hartelijkheid: Je maakt makkelijk contact en bent oprecht geïnteresseerd in anderen.</w:t>
       </w:r>
     </w:p>
     <w:p>
@@ -105,7 +105,7 @@
         <w:ind w:left="567"/>
       </w:pPr>
       <w:r>
-        <w:t>• Sociabiliteit: Je voelt je prettig in groepen, maar hebt geen behoefte om altijd het middelpunt van de aandacht te zijn.</w:t>
+        <w:t>• Sociabiliteit: Je voelt je op je gemak in grote groepen en staat graag in het middelpunt van de aandacht.</w:t>
       </w:r>
     </w:p>
     <w:p>
@@ -114,7 +114,7 @@
         <w:ind w:left="567"/>
       </w:pPr>
       <w:r>
-        <w:t>• Dominantie: Je neemt leiding als het nodig is, maar kunt ook volgen.</w:t>
+        <w:t>• Dominantie: Je neemt het voortouw in gesprekken en beslissingen.</w:t>
       </w:r>
     </w:p>
     <w:p>
@@ -123,7 +123,7 @@
         <w:ind w:left="567"/>
       </w:pPr>
       <w:r>
-        <w:t>• Energie: Je hebt een stabiel energieniveau zonder opvallend uitbundig te zijn.</w:t>
+        <w:t>• Energie: Je hebt een constant hoog energieniveau en bent altijd in beweging.</w:t>
       </w:r>
     </w:p>
     <w:p>
@@ -132,7 +132,7 @@
         <w:ind w:left="567"/>
       </w:pPr>
       <w:r>
-        <w:t>• Avonturisme: Je probeert af en toe iets nieuws maar zoekt niet constant avontuur.</w:t>
+        <w:t>• Avonturisme: Je zoekt spanning en avontuur op en houdt van nieuwe ervaringen.</w:t>
       </w:r>
     </w:p>
     <w:p>
@@ -141,7 +141,7 @@
         <w:ind w:left="567"/>
       </w:pPr>
       <w:r>
-        <w:t>• Vrolijkheid: Je hebt een evenwichtige uitstraling en bent positief zonder overdadig uitbundig te zijn.</w:t>
+        <w:t>• Vrolijkheid: Je hebt een opgewekt karakter en verspreidt positieve energie om je heen.</w:t>
       </w:r>
     </w:p>
     <w:p>
@@ -149,7 +149,7 @@
         <w:rPr>
           <w:b/>
         </w:rPr>
-        <w:t>Altruïsme | 19/30</w:t>
+        <w:t>Altruïsme | 16/30</w:t>
       </w:r>
     </w:p>
     <w:p>
@@ -229,7 +229,7 @@
         <w:rPr>
           <w:b/>
         </w:rPr>
-        <w:t>Consciëntieusheid | 19/30</w:t>
+        <w:t>Consciëntieusheid | 16/30</w:t>
       </w:r>
     </w:p>
     <w:p>
@@ -309,7 +309,7 @@
         <w:rPr>
           <w:b/>
         </w:rPr>
-        <w:t>Neuroticisme | 17/30</w:t>
+        <w:t>Neuroticisme | 32/30</w:t>
       </w:r>
     </w:p>
     <w:p>
@@ -318,7 +318,7 @@
         <w:ind w:left="0"/>
       </w:pPr>
       <w:r>
-        <w:t>Neutrale score op neuroticisme</w:t>
+        <w:t>Hoge score op neuroticisme</w:t>
       </w:r>
     </w:p>
     <w:p>
@@ -327,7 +327,7 @@
         <w:ind w:left="0"/>
       </w:pPr>
       <w:r>
-        <w:t>Als je neutraal scoort op neuroticisme, ervaar je een gebalanceerd emotioneel leven. Je hebt de neiging om stress aan te kunnen en hebt een redelijk stabiele gemoedstoestand, maar soms voel je je bezorgd of geïrriteerd. Je weet je emoties meestal goed te reguleren, maar hebt af en toe momenten van onzekerheid of frustratie. Dit zie je terug in de volgende eigenschappen:</w:t>
+        <w:t>Als je hoog scoort op neuroticisme, ervaar je vaker negatieve emoties zoals angst, frustratie en verdriet. Je reageert sterk op stress en hebt de neiging om gewone situaties als bedreigend of overweldigend te ervaren. Je voelt je vaak zelfbewust en hebt moeite met het beheersen van je emoties. Dit zie je terug in de volgende eigenschappen:</w:t>
       </w:r>
     </w:p>
     <w:p>
@@ -336,7 +336,7 @@
         <w:ind w:left="567"/>
       </w:pPr>
       <w:r>
-        <w:t>• Angst: Je maakt je af en toe zorgen, maar kunt meestal relativeren en kalm blijven in stressvolle situaties. Je denkt niet vaak aan de ergste scenario's.</w:t>
+        <w:t>• Angst: Je maakt je vaak zorgen over de toekomst, zelfs over kleine dingen. Onzekere situaties kunnen je angstig maken, en je denkt vaak aan de ergste uitkomsten.</w:t>
       </w:r>
     </w:p>
     <w:p>
@@ -345,7 +345,7 @@
         <w:ind w:left="567"/>
       </w:pPr>
       <w:r>
-        <w:t>• Ergernis: Je raakt soms geïrriteerd door mensen of situaties, maar het duurt meestal niet lang en je kunt jezelf weer snel kalmeren.</w:t>
+        <w:t>• Ergernis: Je raakt snel geïrriteerd door andere mensen of situaties, zelfs als het om kleine ongemakken gaat. Dit kan leiden tot frustratie en ongemakkelijke interacties.</w:t>
       </w:r>
     </w:p>
     <w:p>
@@ -354,7 +354,7 @@
         <w:ind w:left="567"/>
       </w:pPr>
       <w:r>
-        <w:t>• Depressie: Je hebt niet vaak last van diepe gevoelens van verdriet of hopeloosheid, maar soms kun je je wel een beetje down voelen, vooral als dingen niet goed gaan.</w:t>
+        <w:t>• Depressie: Je hebt de neiging om vaker gevoelens van somberheid of hopeloosheid te ervaren. Als dingen niet goed gaan, kun je je snel overweldigd of neerslachtig voelen.</w:t>
       </w:r>
     </w:p>
     <w:p>
@@ -363,7 +363,7 @@
         <w:ind w:left="567"/>
       </w:pPr>
       <w:r>
-        <w:t>• Schaamte: Je maakt je niet altijd zorgen over hoe anderen je zien, maar af en toe voel je je ongemakkelijk of beschaamd over je acties.</w:t>
+        <w:t>• Schaamte: Je maakt je zorgen over hoe anderen je zien en hebt vaak last van schaamte of zelfkritiek, zelfs voor kleine misstappen.</w:t>
       </w:r>
     </w:p>
     <w:p>
@@ -372,7 +372,7 @@
         <w:ind w:left="567"/>
       </w:pPr>
       <w:r>
-        <w:t>• Impulsiviteit: Je kunt soms impulsief reageren, vooral in stressvolle situaties, maar je hebt meestal het vermogen om je emoties te beheersen.</w:t>
+        <w:t>• Impulsiviteit: Je kunt je emoties moeilijk onder controle houden en reageert soms impulsief. Dit kan leiden tot beslissingen die je later betreurt.</w:t>
       </w:r>
     </w:p>
     <w:p>
@@ -381,7 +381,7 @@
         <w:ind w:left="567"/>
       </w:pPr>
       <w:r>
-        <w:t>• Kwetsbaarheid: Je kunt je af en toe kwetsbaar voelen voor stress, maar je herstelt je relatief snel en blijft meestal kalm in moeilijke situaties.</w:t>
+        <w:t>• Kwetsbaarheid: Je voelt je vaak kwetsbaar voor stressvolle situaties. Je hebt moeite om te herstellen van tegenslagen en bent gevoeliger voor psychologische belasting.</w:t>
       </w:r>
     </w:p>
     <w:p>
@@ -389,7 +389,7 @@
         <w:rPr>
           <w:b/>
         </w:rPr>
-        <w:t>Openheid | 20/30</w:t>
+        <w:t>Openheid | 12/30</w:t>
       </w:r>
     </w:p>
     <w:p>
@@ -398,7 +398,7 @@
         <w:ind w:left="0"/>
       </w:pPr>
       <w:r>
-        <w:t>Hoge score op openheid voor nieuwe ervaringen</w:t>
+        <w:t>Neutrale score op openheid voor nieuwe ervaringen</w:t>
       </w:r>
     </w:p>
     <w:p>
@@ -407,7 +407,7 @@
         <w:ind w:left="0"/>
       </w:pPr>
       <w:r>
-        <w:t>Als je hoog scoort op openheid voor nieuwe ervaringen, ben je nieuwsgierig, creatief en bereid om buiten de gebaande paden te denken. Je hebt een sterk verlangen om nieuwe ideeën en ervaringen te verkennen, en je hebt een brede belangstelling voor kunst, filosofie en andere abstracte concepten. Dit zie je terug in de volgende eigenschappen:</w:t>
+        <w:t>Als je neutraal scoort op openheid voor nieuwe ervaringen, ben je praktisch ingesteld en geïnteresseerd in sommige nieuwe ideeën, maar je houdt je meestal aan vertrouwde en beproefde methoden. Je hebt een zekere belangstelling voor kunst en cultuur, maar niet in dezelfde mate als mensen die hoog scoren op openheid. Je hebt een evenwichtige benadering van het verkennen van nieuwe dingen, zonder dat dit je dagelijks leven te veel beïnvloedt. Dit zie je terug in de volgende eigenschappen:</w:t>
       </w:r>
     </w:p>
     <w:p>
@@ -416,7 +416,7 @@
         <w:ind w:left="567"/>
       </w:pPr>
       <w:r>
-        <w:t>• Fantasie: Je hebt een rijke verbeelding en kunt goed dagdromen of nieuwe, creatieve ideeën ontwikkelen. Je geniet van het verkennen van ongewone gedachten en concepten.</w:t>
+        <w:t>• Fantasie: Je hebt een actieve verbeelding, maar je gaat niet ver buiten de grenzen van wat je gewend bent. Je hebt af en toe creatieve ideeën, maar je vindt het vaak gemakkelijker om praktische oplossingen te bedenken.</w:t>
       </w:r>
     </w:p>
     <w:p>
@@ -425,7 +425,7 @@
         <w:ind w:left="567"/>
       </w:pPr>
       <w:r>
-        <w:t>• Esthetiek: Je hebt een diepe waardering voor kunst en schoonheid. Je voelt je vaak geïnspireerd door muziek, schilderijen, architectuur en andere vormen van kunst.</w:t>
+        <w:t>• Esthetiek: Je hebt een bescheiden waardering voor kunst en schoonheid, maar je gaat er niet per se naar op zoek. Je geniet van kunst, maar het is niet een groot onderdeel van je dagelijks leven.</w:t>
       </w:r>
     </w:p>
     <w:p>
@@ -434,7 +434,7 @@
         <w:ind w:left="567"/>
       </w:pPr>
       <w:r>
-        <w:t>• Gevoelens: Je staat in contact met je eigen emoties en hebt vaak intense gevoelens die je graag uitdrukt of onderzoekt. Je hebt een open benadering van je innerlijke wereld.</w:t>
+        <w:t>• Gevoelens: Je hebt een redelijk goed begrip van je emoties, maar je hebt geen sterke neiging om deze voortdurend te onderzoeken. Je houdt jezelf op een praktische manier in balans.</w:t>
       </w:r>
     </w:p>
     <w:p>
@@ -443,7 +443,7 @@
         <w:ind w:left="567"/>
       </w:pPr>
       <w:r>
-        <w:t>• Veranderbaarheid: Je hebt een flexibele en open houding tegenover verandering. Je hebt geen bezwaar tegen het verkennen van nieuwe manieren van doen en denkt vaak buiten de traditionele normen.</w:t>
+        <w:t>• Veranderbaarheid: Je hebt geen bezwaar tegen veranderingen, maar je waardeert ook stabiliteit en routine. Je bent bereid om je aan te passen, maar ook tevreden met wat werkt.</w:t>
       </w:r>
     </w:p>
     <w:p>
@@ -452,7 +452,7 @@
         <w:ind w:left="567"/>
       </w:pPr>
       <w:r>
-        <w:t>• Ideeën: Je bent geïnteresseerd in abstracte ideeën en filosofieën. Je houdt van discussies over diepe of complexe onderwerpen en zoekt voortdurend naar nieuwe inzichten.</w:t>
+        <w:t>• Ideeën: Je bent geïnteresseerd in ideeën en theorieën, maar je hebt niet altijd de behoefte om alles in vraag te stellen of volledig nieuwe concepten te omarmen.</w:t>
       </w:r>
     </w:p>
     <w:p>
@@ -461,7 +461,7 @@
         <w:ind w:left="567"/>
       </w:pPr>
       <w:r>
-        <w:t>• Waarden: Je hebt vaak een progressieve benadering van ethische en maatschappelijke kwesties. Je bent open-minded en hebt een sterke interesse in diversiteit en nieuwe sociale concepten.</w:t>
+        <w:t>• Waarden: Je hebt traditionele opvattingen, maar staat open voor andere perspectieven. Je bent bereid nieuwe ideeën te overwegen, maar kiest vaak voor de meer beproefde methoden en waarden.</w:t>
       </w:r>
     </w:p>
     <w:p>
@@ -496,12 +496,12 @@
         <w:rPr>
           <w:b/>
         </w:rPr>
-        <w:t xml:space="preserve">Balans vinden | </w:t>
+        <w:t xml:space="preserve">Omhoog komen | </w:t>
       </w:r>
     </w:p>
     <w:p>
       <w:r>
-        <w:t>De loopbaanoriëntatie "Balans vinden" richt zich op jouw streven naar een optimaal evenwicht tussen werk, privé-leven en zelfontwikkeling. Voor jou is werk slechts een deel van je totale levensvervulling. Je hecht veel waarde aan de kwaliteit van leven en zoekt naar manieren om werk en persoonlijk leven in harmonie te brengen. De balans tussen werk en privé kan variëren afhankelijk van de situatie, maar het streven naar een gezonde levensstijl en persoonlijke groei staat centraal in je loopbaanbeslissingen.</w:t>
+        <w:t>De loopbaanoriëntatie "Omhoog komen" is gericht op jouw streven naar vooruitgang binnen een organisatie, waarbij het beklimmen van de hiërarchische ladder en het verkrijgen van meer status en invloed centraal staan. Dit proces gaat gepaard met toenemende verantwoordelijkheden, uitdagingen en kansen om leiderschap te tonen. Prestige en beloning groeien naarmate je hogere posities bereikt, wat jou motivatie biedt om continue professionele ontwikkeling na te streven en strategisch te netwerken binnen de organisatie.</w:t>
       </w:r>
     </w:p>
     <w:p>
@@ -557,7 +557,7 @@
         <w:rPr>
           <w:b/>
         </w:rPr>
-        <w:t xml:space="preserve">Wetenschap, technologie, engineering en mathematica | </w:t>
+        <w:t xml:space="preserve">Milieu, Landbouw, voeding en natuurlijke grondstoffen | </w:t>
       </w:r>
     </w:p>
     <w:p>
@@ -566,7 +566,7 @@
         <w:ind w:left="0"/>
       </w:pPr>
       <w:r>
-        <w:t>Wetenschap, technologie, engineering en wiskunde (STEM) omvat:</w:t>
+        <w:t>De sector "Milieu, landbouw, voeding en natuurlijke grondstoffen" omvat een breed scala aan activiteiten gericht op de productie, verwerking, marketing, distributie, financiering en ontwikkeling van agrarische grondstoffen en hulpbronnen. Dit omvat onder andere:</w:t>
       </w:r>
     </w:p>
     <w:p>
@@ -575,7 +575,7 @@
         <w:ind w:left="567"/>
       </w:pPr>
       <w:r>
-        <w:t>• Planning en beheer van wetenschappelijk onderzoek en technologische ontwikkelingen.</w:t>
+        <w:t>• Voedsel: Productie en verwerking van gewassen en vee voor menselijke consumptie.</w:t>
       </w:r>
     </w:p>
     <w:p>
@@ -584,7 +584,7 @@
         <w:ind w:left="567"/>
       </w:pPr>
       <w:r>
-        <w:t>• Professionele en technische diensten zoals engineering en technologie, inclusief laboratorium- en testdiensten.</w:t>
+        <w:t>• Vezels: Productie van plantaardige vezels zoals katoen en dierlijke vezels zoals wol.</w:t>
       </w:r>
     </w:p>
     <w:p>
@@ -593,7 +593,34 @@
         <w:ind w:left="567"/>
       </w:pPr>
       <w:r>
-        <w:t>• Onderzoek en ontwikkeling: Het ontwikkelen van nieuwe technologieën, producten en innovaties.</w:t>
+        <w:t>• Houtproducten: Productie en verwerking van hout voor diverse toepassingen, van bouwmateriaal tot papier.</w:t>
+      </w:r>
+    </w:p>
+    <w:p>
+      <w:pPr>
+        <w:spacing w:after="120"/>
+        <w:ind w:left="567"/>
+      </w:pPr>
+      <w:r>
+        <w:t>• Natuurlijke hulpbronnen: Exploitatie en beheer van hulpbronnen zoals water, mineralen en energiebronnen.</w:t>
+      </w:r>
+    </w:p>
+    <w:p>
+      <w:pPr>
+        <w:spacing w:after="120"/>
+        <w:ind w:left="567"/>
+      </w:pPr>
+      <w:r>
+        <w:t>• Tuinbouw: Teelt van groenten, fruit, bloemen en planten voor consumptie en decoratie.</w:t>
+      </w:r>
+    </w:p>
+    <w:p>
+      <w:pPr>
+        <w:spacing w:after="120"/>
+        <w:ind w:left="567"/>
+      </w:pPr>
+      <w:r>
+        <w:t>• Plantaardige en dierlijke producten: Productie en verwerking van diverse andere agrarische producten, zoals oliën, kruiden en dierlijke bijproducten.</w:t>
       </w:r>
     </w:p>
     <w:p>
@@ -602,7 +629,7 @@
         <w:ind w:left="0"/>
       </w:pPr>
       <w:r>
-        <w:t>Deze sector draagt bij aan vooruitgang in verschillende disciplines door middel van wetenschappelijk onderzoek, technologische innovatie en het leveren van technische expertise.</w:t>
+        <w:t>Deze sector speelt een cruciale rol in het voorzien van essentiële producten en materialen, en draagt bij aan de economische ontwikkeling door middel van innovatie en duurzaam beheer van natuurlijke hulpbronnen.</w:t>
       </w:r>
     </w:p>
     <w:p>
@@ -618,7 +645,7 @@
         <w:rPr>
           <w:b/>
         </w:rPr>
-        <w:t xml:space="preserve">Transport, distributie en logistiek | </w:t>
+        <w:t xml:space="preserve">Architectuur en constructie | </w:t>
       </w:r>
     </w:p>
     <w:p>
@@ -627,7 +654,7 @@
         <w:ind w:left="0"/>
       </w:pPr>
       <w:r>
-        <w:t>Transport, distributie en logistiek omvat:</w:t>
+        <w:t>De sector "Architectuur en constructie" omvat een breed scala aan carrières die zich richten op het ontwerpen, plannen, beheren, bouwen en behouden van de gebouwde omgeving. Dit omvat onder andere:</w:t>
       </w:r>
     </w:p>
     <w:p>
@@ -636,7 +663,7 @@
         <w:ind w:left="567"/>
       </w:pPr>
       <w:r>
-        <w:t>• Planning, beheer en uitvoering van het verplaatsen van mensen, materialen en goederen over de weg, via pijpleidingen, luchtvaart, spoorwegen en waterwegen.</w:t>
+        <w:t>• Ontwerpen: Architecten en ontwerpers creëren de plannen voor nieuwe gebouwen en infrastructuur, rekening houdend met functionaliteit, esthetiek en duurzaamheid.</w:t>
       </w:r>
     </w:p>
     <w:p>
@@ -645,7 +672,7 @@
         <w:ind w:left="567"/>
       </w:pPr>
       <w:r>
-        <w:t>• Transportinfrastructuur: Ontwikkeling en onderhoud van infrastructuur zoals wegen, bruggen, havens en luchthavens.</w:t>
+        <w:t>• Plannen: Stedenbouwkundigen en projectmanagers coördineren de ontwikkeling van bouwprojecten, van concept tot voltooiing, inclusief het opstellen van gedetailleerde bouwplannen en tijdlijnen.</w:t>
       </w:r>
     </w:p>
     <w:p>
@@ -654,7 +681,7 @@
         <w:ind w:left="567"/>
       </w:pPr>
       <w:r>
-        <w:t>• Logistieke diensten: Beheer van voorraad, opslag en distributie van goederen.</w:t>
+        <w:t>• Beheren: Bouwmanagers en supervisors zorgen voor de organisatie en supervisie van bouwactiviteiten, waarbij ze ervoor zorgen dat projecten op schema en binnen budget worden uitgevoerd.</w:t>
       </w:r>
     </w:p>
     <w:p>
@@ -663,7 +690,7 @@
         <w:ind w:left="567"/>
       </w:pPr>
       <w:r>
-        <w:t>• Planning en beheer: Coördinatie van transportroutes, schema's en logistieke processen.</w:t>
+        <w:t>• Bouwen: Bouwvakkers, ingenieurs en aannemers werken samen aan de fysieke constructie van gebouwen, bruggen, wegen en andere infrastructuur.</w:t>
       </w:r>
     </w:p>
     <w:p>
@@ -672,7 +699,7 @@
         <w:ind w:left="567"/>
       </w:pPr>
       <w:r>
-        <w:t>• Technische ondersteuningsdiensten: Onderhoud van voertuigen, apparatuur en faciliteiten om een efficiënte werking te garanderen.</w:t>
+        <w:t>• Behoud: Restaurateurs en onderhoudsspecialisten richten zich op het behoud en de renovatie van bestaande gebouwen en historische structuren, zodat deze duurzaam en veilig blijven.</w:t>
       </w:r>
     </w:p>
     <w:p>
@@ -681,7 +708,7 @@
         <w:ind w:left="0"/>
       </w:pPr>
       <w:r>
-        <w:t>Deze sector speelt een essentiële rol in het faciliteren van handel, transport en mobiliteit en draagt bij aan economische groei door het optimaliseren van transport- en logistieke oplossingen wereldwijd.</w:t>
+        <w:t>Deze sector speelt een cruciale rol in de vormgeving van onze leefomgeving en draagt bij aan economische ontwikkeling, stedelijke planning en het behoud van cultureel erfgoed.</w:t>
       </w:r>
     </w:p>
     <w:p>
@@ -970,10 +997,7 @@
     </w:p>
     <w:p>
       <w:r>
-        <w:t>Integer orci massa, vestibulum ac leo at, suscipit accumsan purus. Vestibulum commodo neque sit amet leo efficitur, vitae tempor velit volutpat. Etiam est magna, porttitor eget tellus nec, rutrum bibendum metus. Pellentesque habitant morbi tristique senectus et netus et malesuada fames ac turpis egestas. In hendrerit sapien et aliquet vehicula. Phasellus eleifend, libero vel egestas sodales, lorem nisi aliquam dui, at eleifend mauris massa non est. Nunc sed placerat nisl. Nullam ac purus ut sem pretium efficitur.</w:t>
-        <w:br/>
-        <w:br/>
-        <w:t>Donec elementum enim nisl, vitae mattis diam iaculis ut. In hac habitasse platea dictumst. Cras hendrerit in odio vitae pretium. Praesent aliquet scelerisque orci, at laoreet neque rutrum sed. Maecenas augue turpis, sodales ac efficitur interdum, scelerisque id felis. Donec tincidunt, magna eu ultricies convallis, est ante rutrum enim, dictum varius felis mi porta neque. Donec fermentum laoreet turpis, at hendrerit nulla vestibulum vitae. Praesent vulputate ex a tempor iaculis.</w:t>
+        <w:t>asdfghjka</w:t>
       </w:r>
     </w:p>
     <w:p>
@@ -986,10 +1010,7 @@
     </w:p>
     <w:p>
       <w:r>
-        <w:t>Integer orci massa, vestibulum ac leo at, suscipit accumsan purus. Vestibulum commodo neque sit amet leo efficitur, vitae tempor velit volutpat. Etiam est magna, porttitor eget tellus nec, rutrum bibendum metus. Pellentesque habitant morbi tristique senectus et netus et malesuada fames ac turpis egestas. In hendrerit sapien et aliquet vehicula. Phasellus eleifend, libero vel egestas sodales, lorem nisi aliquam dui, at eleifend mauris massa non est. Nunc sed placerat nisl. Nullam ac purus ut sem pretium efficitur.</w:t>
-        <w:br/>
-        <w:br/>
-        <w:t>Donec elementum enim nisl, vitae mattis diam iaculis ut. In hac habitasse platea dictumst. Cras hendrerit in odio vitae pretium. Praesent aliquet scelerisque orci, at laoreet neque rutrum sed. Maecenas augue turpis, sodales ac efficitur interdum, scelerisque id felis. Donec tincidunt, magna eu ultricies convallis, est ante rutrum enim, dictum varius felis mi porta neque.</w:t>
+        <w:t>asdfghjka</w:t>
       </w:r>
     </w:p>
     <w:p>
@@ -1002,13 +1023,9 @@
     </w:p>
     <w:p>
       <w:r>
-        <w:t>Integer orci massa, vestibulum ac leo at, suscipit accumsan purus. Vestibulum commodo neque sit amet leo efficitur, vitae tempor velit volutpat. Etiam est magna, porttitor eget tellus nec, rutrum bibendum metus. Pellentesque habitant morbi tristique senectus et netus et malesuada fames ac turpis egestas. In hendrerit sapien et aliquet vehicula. Phasellus eleifend, libero vel egestas sodales, lorem nisi aliquam dui, at eleifend mauris massa non est. Nunc sed placerat nisl. Nullam ac purus ut sem pretium efficitur.</w:t>
+        <w:t>asdfghjka</w:t>
         <w:br/>
-        <w:br/>
-        <w:t>Donec elementum enim nisl, vitae mattis diam iaculis ut. In hac habitasse platea dictumst.Integer orci massa, vestibulum ac leo at, suscipit accumsan purus. Vestibulum commodo neque sit amet leo efficitur, vitae tempor velit volutpat. Etiam est magna, porttitor eget tellus nec, rutrum bibendum metus. Pellentesque habitant morbi tristique senectus et netus et malesuada fames ac turpis egestas. In hendrerit sapien et aliquet vehicula. Phasellus eleifend, libero vel egestas sodales, lorem nisi aliquam dui, at eleifend mauris massa non est. Nunc sed placerat nisl. Nullam ac purus ut sem pretium efficitur.</w:t>
-        <w:br/>
-        <w:br/>
-        <w:t>Donec elementum enim nisl, vitae mattis diam iaculis ut. In hac habitasse platea dictumst. Cras hendrerit in odio vitae pretium. Praesent aliquet scelerisque orci, at laoreet neque rutrum sed. Maecenas augue turpis, sodales ac efficitur interdum, scelerisque id felis. Donec tincidunt, magna eu ultricies convallis, est ante rutrum enim, dictum varius felis mi porta neque. Donec fermentum laoreet turpis, at hendrerit nulla vestibulum vitae. Praesent vulputate ex a tempor iaculis.</w:t>
+        <w:t>asdfghjka</w:t>
       </w:r>
     </w:p>
     <w:p>
@@ -1021,10 +1038,13 @@
     </w:p>
     <w:p>
       <w:r>
-        <w:t>Integer orci massa, vestibulum ac leo at, suscipit accumsan purus. Vestibulum commodo neque sit amet leo efficitur, vitae tempor velit volutpat. Etiam est magna, porttitor eget tellus nec, rutrum bibendum metus. Pellentesque habitant morbi tristique senectus et netus et malesuada fames ac turpis egestas. In hendrerit sapien et aliquet vehicula. Phasellus eleifend, libero vel egestas sodales, lorem nisi aliquam dui, at eleifend mauris massa non est. Nunc sed placerat nisl. Nullam ac purus ut sem pretium efficitur.</w:t>
+        <w:t>asdfghjka</w:t>
         <w:br/>
+        <w:t>asdfghjka</w:t>
         <w:br/>
-        <w:t>Donec elementum enim nisl, vitae mattis diam iaculis ut. In hac habitasse platea dictumst. Cras hendrerit in odio vitae pretium. Praesent aliquet scelerisque orci, at laoreet neque rutrum sed. Maecenas augue turpis, sodales ac efficitur interdum, scelerisque id felis. Donec tincidunt, magna eu ultricies convallis, est ante rutrum enim, dictum varius felis mi porta neque. Donec fermentum laoreet turpis, at hendrerit nulla vestibulum vitae.</w:t>
+        <w:t>asdfghjka</w:t>
+        <w:br/>
+        <w:t>asdfghjka</w:t>
       </w:r>
     </w:p>
     <w:p>
@@ -1037,7 +1057,17 @@
     </w:p>
     <w:p>
       <w:r>
-        <w:t>Integer orci massa, vestibulum ac leo at, suscipit accumsan purus. Vestibulum commodo neque sit amet leo efficitur, vitae tempor velit volutpat. Etiam est magna, porttitor eget tellus nec, rutrum bibendum metus. Pellentesque habitant morbi tristique senectus et netus et malesuada fames ac turpis egestas. In hendrerit sapien et aliquet vehicula. Phasellus eleifend, libero vel egestas sodales, lorem nisi aliquam dui, at eleifend mauris massa non est. Nunc sed placerat nisl.</w:t>
+        <w:t>asdfghjka</w:t>
+        <w:br/>
+        <w:t>asdfghjka</w:t>
+        <w:br/>
+        <w:t>asdfghjka</w:t>
+        <w:br/>
+        <w:t>asdfghjka</w:t>
+        <w:br/>
+        <w:t>asdfghjka</w:t>
+        <w:br/>
+        <w:t>asdfghjka</w:t>
       </w:r>
     </w:p>
     <w:sectPr>

</xml_diff>